<commit_message>
Eliminar información duplicada y unificar formato de ubicación en todos los formularios
</commit_message>
<xml_diff>
--- a/FORMULARIOS/NOTA DE DONACION.docx
+++ b/FORMULARIOS/NOTA DE DONACION.docx
@@ -86,42 +86,16 @@
             </w:tcMar>
           </w:tcPr>
           <w:p>
-            <w:pPr>
-              <w:spacing w:after="20" w:line="276" w:lineRule="auto"/>
-            </w:pPr>
             <w:r>
-              <w:rPr>
-                <w:rFonts w:ascii="Arial" w:hAnsi="Arial"/>
-                <w:b/>
-                <w:color w:val="2D6A4F"/>
-                <w:sz w:val="24"/>
-              </w:rPr>
               <w:t>FUNDACIÓN ESPACIO DE VIDA</w:t>
               <w:br/>
               <w:t>ENTIDAD RECEPTORA SIN FINES DE LUCRO</w:t>
               <w:br/>
               <w:t>RUC: 80087692-0  |  Decreto Presidencial N° 1913/2014</w:t>
               <w:br/>
-              <w:t>Email: espaciodevidafundacion@gmail.com • Tel: 0991.978.413</w:t>
+              <w:t>Dirección: Capitán Figari c/ Piribebuy 643, B° Kennedy, Lambaré (Dpto. Central)</w:t>
               <w:br/>
-              <w:t>Dirección: Capitán Figari c/ Piribebuy 643, B° Kennedy, Lambaré - Central</w:t>
-              <w:br/>
-              <w:t>Tel: 0991.978.413 | Web: www.fundacionespaciodevida.org.py</w:t>
-            </w:r>
-            <w:r>
-              <w:rPr>
-                <w:rFonts w:ascii="Arial" w:hAnsi="Arial"/>
-                <w:b/>
-                <w:color w:val="334155"/>
-                <w:sz w:val="17"/>
-              </w:rPr>
-            </w:r>
-            <w:r>
-              <w:rPr>
-                <w:rFonts w:ascii="Arial" w:hAnsi="Arial"/>
-                <w:color w:val="334155"/>
-                <w:sz w:val="16"/>
-              </w:rPr>
+              <w:t>Tel: 0991.978.413  |  Email: espaciodevidafundacion@gmail.com  |  Web: www.fundacionespaciodevida.org.py</w:t>
             </w:r>
           </w:p>
         </w:tc>

</xml_diff>